<commit_message>
Add GitHub profile link to README and include GitHub link in contact section of index.html
</commit_message>
<xml_diff>
--- a/Ben-Madle-Jordan-CV.docx
+++ b/Ben-Madle-Jordan-CV.docx
@@ -6,7 +6,7 @@
       <w:pPr>
         <w:pStyle w:val="Heading1"/>
         <w:spacing w:before="0" w:after="0"/>
-        <w:divId w:val="764612544"/>
+        <w:divId w:val="1972056843"/>
         <w:rPr>
           <w:rFonts w:ascii="Arial Nova" w:eastAsia="Times New Roman" w:hAnsi="Arial Nova" w:cs="Segoe UI"/>
           <w:spacing w:val="-7"/>
@@ -28,7 +28,7 @@
     <w:p>
       <w:pPr>
         <w:pStyle w:val="cv-title"/>
-        <w:divId w:val="764612544"/>
+        <w:divId w:val="1972056843"/>
         <w:rPr>
           <w:rFonts w:ascii="Arial Nova" w:hAnsi="Arial Nova" w:cs="Segoe UI"/>
           <w:lang w:val="en"/>
@@ -45,7 +45,7 @@
     <w:p>
       <w:pPr>
         <w:pStyle w:val="cv-contact"/>
-        <w:divId w:val="764612544"/>
+        <w:divId w:val="1972056843"/>
         <w:rPr>
           <w:rFonts w:ascii="Arial Nova" w:hAnsi="Arial Nova" w:cs="Segoe UI"/>
           <w:lang w:val="en"/>
@@ -82,6 +82,23 @@
             <w:color w:val="0000FF"/>
             <w:lang w:val="en"/>
           </w:rPr>
+          <w:t>GitHub</w:t>
+        </w:r>
+      </w:hyperlink>
+      <w:r>
+        <w:rPr>
+          <w:rFonts w:ascii="Arial Nova" w:hAnsi="Arial Nova" w:cs="Segoe UI"/>
+          <w:lang w:val="en"/>
+        </w:rPr>
+        <w:t xml:space="preserve"> </w:t>
+      </w:r>
+      <w:hyperlink r:id="rId7" w:history="1">
+        <w:r>
+          <w:rPr>
+            <w:rFonts w:ascii="Arial Nova" w:hAnsi="Arial Nova" w:cs="Segoe UI"/>
+            <w:color w:val="0000FF"/>
+            <w:lang w:val="en"/>
+          </w:rPr>
           <w:t>LinkedIn</w:t>
         </w:r>
       </w:hyperlink>
@@ -96,7 +113,7 @@
     <w:p>
       <w:pPr>
         <w:pStyle w:val="Heading2"/>
-        <w:divId w:val="764612544"/>
+        <w:divId w:val="1972056843"/>
         <w:rPr>
           <w:rFonts w:ascii="Arial Nova" w:eastAsia="Times New Roman" w:hAnsi="Arial Nova" w:cs="Segoe UI"/>
           <w:lang w:val="en"/>
@@ -113,7 +130,7 @@
     <w:p>
       <w:pPr>
         <w:pStyle w:val="NormalWeb"/>
-        <w:divId w:val="764612544"/>
+        <w:divId w:val="1972056843"/>
         <w:rPr>
           <w:rFonts w:ascii="Arial Nova" w:hAnsi="Arial Nova" w:cs="Segoe UI"/>
           <w:lang w:val="en"/>
@@ -137,7 +154,7 @@
     <w:p>
       <w:pPr>
         <w:pStyle w:val="Heading2"/>
-        <w:divId w:val="764612544"/>
+        <w:divId w:val="1972056843"/>
         <w:rPr>
           <w:rFonts w:ascii="Arial Nova" w:eastAsia="Times New Roman" w:hAnsi="Arial Nova" w:cs="Segoe UI"/>
           <w:lang w:val="en"/>
@@ -154,7 +171,7 @@
     <w:p>
       <w:pPr>
         <w:pStyle w:val="Heading3"/>
-        <w:divId w:val="764612544"/>
+        <w:divId w:val="1972056843"/>
         <w:rPr>
           <w:rFonts w:ascii="Arial Nova" w:eastAsia="Times New Roman" w:hAnsi="Arial Nova" w:cs="Segoe UI"/>
           <w:lang w:val="en"/>
@@ -170,7 +187,7 @@
     </w:p>
     <w:p>
       <w:pPr>
-        <w:divId w:val="1113355080"/>
+        <w:divId w:val="1754086509"/>
         <w:rPr>
           <w:rFonts w:ascii="Arial Nova" w:eastAsia="Times New Roman" w:hAnsi="Arial Nova" w:cs="Segoe UI"/>
           <w:lang w:val="en"/>
@@ -191,7 +208,7 @@
           <w:numId w:val="1"/>
         </w:numPr>
         <w:spacing w:before="100" w:beforeAutospacing="1" w:after="100" w:afterAutospacing="1"/>
-        <w:divId w:val="764612544"/>
+        <w:divId w:val="1972056843"/>
         <w:rPr>
           <w:rFonts w:ascii="Arial Nova" w:eastAsia="Times New Roman" w:hAnsi="Arial Nova" w:cs="Segoe UI"/>
           <w:lang w:val="en"/>
@@ -242,7 +259,7 @@
           <w:numId w:val="1"/>
         </w:numPr>
         <w:spacing w:before="100" w:beforeAutospacing="1" w:after="100" w:afterAutospacing="1"/>
-        <w:divId w:val="764612544"/>
+        <w:divId w:val="1972056843"/>
         <w:rPr>
           <w:rFonts w:ascii="Arial Nova" w:eastAsia="Times New Roman" w:hAnsi="Arial Nova" w:cs="Segoe UI"/>
           <w:lang w:val="en"/>
@@ -300,7 +317,7 @@
           <w:numId w:val="1"/>
         </w:numPr>
         <w:spacing w:before="100" w:beforeAutospacing="1" w:after="100" w:afterAutospacing="1"/>
-        <w:divId w:val="764612544"/>
+        <w:divId w:val="1972056843"/>
         <w:rPr>
           <w:rFonts w:ascii="Arial Nova" w:eastAsia="Times New Roman" w:hAnsi="Arial Nova" w:cs="Segoe UI"/>
           <w:lang w:val="en"/>
@@ -336,7 +353,7 @@
           <w:numId w:val="1"/>
         </w:numPr>
         <w:spacing w:before="100" w:beforeAutospacing="1" w:after="100" w:afterAutospacing="1"/>
-        <w:divId w:val="764612544"/>
+        <w:divId w:val="1972056843"/>
         <w:rPr>
           <w:rFonts w:ascii="Arial Nova" w:eastAsia="Times New Roman" w:hAnsi="Arial Nova" w:cs="Segoe UI"/>
           <w:lang w:val="en"/>
@@ -372,7 +389,7 @@
           <w:numId w:val="1"/>
         </w:numPr>
         <w:spacing w:before="100" w:beforeAutospacing="1" w:after="100" w:afterAutospacing="1"/>
-        <w:divId w:val="764612544"/>
+        <w:divId w:val="1972056843"/>
         <w:rPr>
           <w:rFonts w:ascii="Arial Nova" w:eastAsia="Times New Roman" w:hAnsi="Arial Nova" w:cs="Segoe UI"/>
           <w:lang w:val="en"/>
@@ -423,7 +440,7 @@
           <w:numId w:val="1"/>
         </w:numPr>
         <w:spacing w:before="100" w:beforeAutospacing="1" w:after="100" w:afterAutospacing="1"/>
-        <w:divId w:val="764612544"/>
+        <w:divId w:val="1972056843"/>
         <w:rPr>
           <w:rFonts w:ascii="Arial Nova" w:eastAsia="Times New Roman" w:hAnsi="Arial Nova" w:cs="Segoe UI"/>
           <w:lang w:val="en"/>
@@ -455,7 +472,7 @@
     <w:p>
       <w:pPr>
         <w:pStyle w:val="Heading3"/>
-        <w:divId w:val="764612544"/>
+        <w:divId w:val="1972056843"/>
         <w:rPr>
           <w:rFonts w:ascii="Arial Nova" w:eastAsia="Times New Roman" w:hAnsi="Arial Nova" w:cs="Segoe UI"/>
           <w:lang w:val="en"/>
@@ -471,7 +488,7 @@
     </w:p>
     <w:p>
       <w:pPr>
-        <w:divId w:val="347634095"/>
+        <w:divId w:val="382752338"/>
         <w:rPr>
           <w:rFonts w:ascii="Arial Nova" w:eastAsia="Times New Roman" w:hAnsi="Arial Nova" w:cs="Segoe UI"/>
           <w:lang w:val="en"/>
@@ -492,7 +509,7 @@
           <w:numId w:val="2"/>
         </w:numPr>
         <w:spacing w:before="100" w:beforeAutospacing="1" w:after="100" w:afterAutospacing="1"/>
-        <w:divId w:val="764612544"/>
+        <w:divId w:val="1972056843"/>
         <w:rPr>
           <w:rFonts w:ascii="Arial Nova" w:eastAsia="Times New Roman" w:hAnsi="Arial Nova" w:cs="Segoe UI"/>
           <w:lang w:val="en"/>
@@ -528,7 +545,7 @@
           <w:numId w:val="2"/>
         </w:numPr>
         <w:spacing w:before="100" w:beforeAutospacing="1" w:after="100" w:afterAutospacing="1"/>
-        <w:divId w:val="764612544"/>
+        <w:divId w:val="1972056843"/>
         <w:rPr>
           <w:rFonts w:ascii="Arial Nova" w:eastAsia="Times New Roman" w:hAnsi="Arial Nova" w:cs="Segoe UI"/>
           <w:lang w:val="en"/>
@@ -594,7 +611,7 @@
           <w:numId w:val="2"/>
         </w:numPr>
         <w:spacing w:before="100" w:beforeAutospacing="1" w:after="100" w:afterAutospacing="1"/>
-        <w:divId w:val="764612544"/>
+        <w:divId w:val="1972056843"/>
         <w:rPr>
           <w:rFonts w:ascii="Arial Nova" w:eastAsia="Times New Roman" w:hAnsi="Arial Nova" w:cs="Segoe UI"/>
           <w:lang w:val="en"/>
@@ -630,7 +647,7 @@
           <w:numId w:val="2"/>
         </w:numPr>
         <w:spacing w:before="100" w:beforeAutospacing="1" w:after="100" w:afterAutospacing="1"/>
-        <w:divId w:val="764612544"/>
+        <w:divId w:val="1972056843"/>
         <w:rPr>
           <w:rFonts w:ascii="Arial Nova" w:eastAsia="Times New Roman" w:hAnsi="Arial Nova" w:cs="Segoe UI"/>
           <w:lang w:val="en"/>
@@ -669,7 +686,7 @@
     <w:p>
       <w:pPr>
         <w:pStyle w:val="Heading3"/>
-        <w:divId w:val="764612544"/>
+        <w:divId w:val="1972056843"/>
         <w:rPr>
           <w:rFonts w:ascii="Arial Nova" w:eastAsia="Times New Roman" w:hAnsi="Arial Nova" w:cs="Segoe UI"/>
           <w:lang w:val="en"/>
@@ -685,7 +702,7 @@
     </w:p>
     <w:p>
       <w:pPr>
-        <w:divId w:val="89664963"/>
+        <w:divId w:val="1272519267"/>
         <w:rPr>
           <w:rFonts w:ascii="Arial Nova" w:eastAsia="Times New Roman" w:hAnsi="Arial Nova" w:cs="Segoe UI"/>
           <w:lang w:val="en"/>
@@ -706,7 +723,7 @@
           <w:numId w:val="3"/>
         </w:numPr>
         <w:spacing w:before="100" w:beforeAutospacing="1" w:after="100" w:afterAutospacing="1"/>
-        <w:divId w:val="764612544"/>
+        <w:divId w:val="1972056843"/>
         <w:rPr>
           <w:rFonts w:ascii="Arial Nova" w:eastAsia="Times New Roman" w:hAnsi="Arial Nova" w:cs="Segoe UI"/>
           <w:lang w:val="en"/>
@@ -742,7 +759,7 @@
           <w:numId w:val="3"/>
         </w:numPr>
         <w:spacing w:before="100" w:beforeAutospacing="1" w:after="100" w:afterAutospacing="1"/>
-        <w:divId w:val="764612544"/>
+        <w:divId w:val="1972056843"/>
         <w:rPr>
           <w:rFonts w:ascii="Arial Nova" w:eastAsia="Times New Roman" w:hAnsi="Arial Nova" w:cs="Segoe UI"/>
           <w:lang w:val="en"/>
@@ -778,7 +795,7 @@
           <w:numId w:val="3"/>
         </w:numPr>
         <w:spacing w:before="100" w:beforeAutospacing="1" w:after="100" w:afterAutospacing="1"/>
-        <w:divId w:val="764612544"/>
+        <w:divId w:val="1972056843"/>
         <w:rPr>
           <w:rFonts w:ascii="Arial Nova" w:eastAsia="Times New Roman" w:hAnsi="Arial Nova" w:cs="Segoe UI"/>
           <w:lang w:val="en"/>
@@ -845,7 +862,7 @@
           <w:numId w:val="3"/>
         </w:numPr>
         <w:spacing w:before="100" w:beforeAutospacing="1" w:after="100" w:afterAutospacing="1"/>
-        <w:divId w:val="764612544"/>
+        <w:divId w:val="1972056843"/>
         <w:rPr>
           <w:rFonts w:ascii="Arial Nova" w:eastAsia="Times New Roman" w:hAnsi="Arial Nova" w:cs="Segoe UI"/>
           <w:lang w:val="en"/>
@@ -884,7 +901,7 @@
     <w:p>
       <w:pPr>
         <w:pStyle w:val="Heading3"/>
-        <w:divId w:val="764612544"/>
+        <w:divId w:val="1972056843"/>
         <w:rPr>
           <w:rFonts w:ascii="Arial Nova" w:eastAsia="Times New Roman" w:hAnsi="Arial Nova" w:cs="Segoe UI"/>
           <w:lang w:val="en"/>
@@ -900,7 +917,7 @@
     </w:p>
     <w:p>
       <w:pPr>
-        <w:divId w:val="2131700219"/>
+        <w:divId w:val="1525710385"/>
         <w:rPr>
           <w:rFonts w:ascii="Arial Nova" w:eastAsia="Times New Roman" w:hAnsi="Arial Nova" w:cs="Segoe UI"/>
           <w:lang w:val="en"/>
@@ -921,7 +938,7 @@
           <w:numId w:val="4"/>
         </w:numPr>
         <w:spacing w:before="100" w:beforeAutospacing="1" w:after="100" w:afterAutospacing="1"/>
-        <w:divId w:val="764612544"/>
+        <w:divId w:val="1972056843"/>
         <w:rPr>
           <w:rFonts w:ascii="Arial Nova" w:eastAsia="Times New Roman" w:hAnsi="Arial Nova" w:cs="Segoe UI"/>
           <w:lang w:val="en"/>
@@ -957,7 +974,7 @@
           <w:numId w:val="4"/>
         </w:numPr>
         <w:spacing w:before="100" w:beforeAutospacing="1" w:after="100" w:afterAutospacing="1"/>
-        <w:divId w:val="764612544"/>
+        <w:divId w:val="1972056843"/>
         <w:rPr>
           <w:rFonts w:ascii="Arial Nova" w:eastAsia="Times New Roman" w:hAnsi="Arial Nova" w:cs="Segoe UI"/>
           <w:lang w:val="en"/>
@@ -1044,9 +1061,9 @@
 <file path=word/numbering.xml><?xml version="1.0" encoding="utf-8"?>
 <w:numbering xmlns:wpc="http://schemas.microsoft.com/office/word/2010/wordprocessingCanvas" xmlns:cx="http://schemas.microsoft.com/office/drawing/2014/chartex" xmlns:cx1="http://schemas.microsoft.com/office/drawing/2015/9/8/chartex" xmlns:cx2="http://schemas.microsoft.com/office/drawing/2015/10/21/chartex" xmlns:cx3="http://schemas.microsoft.com/office/drawing/2016/5/9/chartex" xmlns:cx4="http://schemas.microsoft.com/office/drawing/2016/5/10/chartex" xmlns:cx5="http://schemas.microsoft.com/office/drawing/2016/5/11/chartex" xmlns:cx6="http://schemas.microsoft.com/office/drawing/2016/5/12/chartex" xmlns:cx7="http://schemas.microsoft.com/office/drawing/2016/5/13/chartex" xmlns:cx8="http://schemas.microsoft.com/office/drawing/2016/5/14/chartex" xmlns:mc="http://schemas.openxmlformats.org/markup-compatibility/2006" xmlns:aink="http://schemas.microsoft.com/office/drawing/2016/ink" xmlns:am3d="http://schemas.microsoft.com/office/drawing/2017/model3d" xmlns:o="urn:schemas-microsoft-com:office:office" xmlns:oel="http://schemas.microsoft.com/office/2019/extlst" xmlns:r="http://schemas.openxmlformats.org/officeDocument/2006/relationships" xmlns:m="http://schemas.openxmlformats.org/officeDocument/2006/math" xmlns:v="urn:schemas-microsoft-com:vml" xmlns:wp14="http://schemas.microsoft.com/office/word/2010/wordprocessingDrawing" xmlns:wp="http://schemas.openxmlformats.org/drawingml/2006/wordprocessingDrawing" xmlns:w10="urn:schemas-microsoft-com:office:word" xmlns:w="http://schemas.openxmlformats.org/wordprocessingml/2006/main" xmlns:w14="http://schemas.microsoft.com/office/word/2010/wordml" xmlns:w15="http://schemas.microsoft.com/office/word/2012/wordml" xmlns:w16cex="http://schemas.microsoft.com/office/word/2018/wordml/cex" xmlns:w16cid="http://schemas.microsoft.com/office/word/2016/wordml/cid" xmlns:w16="http://schemas.microsoft.com/office/word/2018/wordml" xmlns:w16du="http://schemas.microsoft.com/office/word/2023/wordml/word16du" xmlns:w16sdtdh="http://schemas.microsoft.com/office/word/2020/wordml/sdtdatahash" xmlns:w16sdtfl="http://schemas.microsoft.com/office/word/2024/wordml/sdtformatlock" xmlns:w16se="http://schemas.microsoft.com/office/word/2015/wordml/symex" xmlns:wpg="http://schemas.microsoft.com/office/word/2010/wordprocessingGroup" xmlns:wpi="http://schemas.microsoft.com/office/word/2010/wordprocessingInk" xmlns:wne="http://schemas.microsoft.com/office/word/2006/wordml" xmlns:wps="http://schemas.microsoft.com/office/word/2010/wordprocessingShape" mc:Ignorable="w14 w15 w16se w16cid w16 w16cex w16sdtdh w16sdtfl w16du wp14">
   <w:abstractNum w:abstractNumId="0" w15:restartNumberingAfterBreak="0">
-    <w:nsid w:val="1B9F5207"/>
+    <w:nsid w:val="2EC155B6"/>
     <w:multiLevelType w:val="multilevel"/>
-    <w:tmpl w:val="1FBE4680"/>
+    <w:tmpl w:val="EBB89202"/>
     <w:lvl w:ilvl="0">
       <w:start w:val="1"/>
       <w:numFmt w:val="bullet"/>
@@ -1193,9 +1210,9 @@
     </w:lvl>
   </w:abstractNum>
   <w:abstractNum w:abstractNumId="1" w15:restartNumberingAfterBreak="0">
-    <w:nsid w:val="33964D97"/>
+    <w:nsid w:val="3E505218"/>
     <w:multiLevelType w:val="multilevel"/>
-    <w:tmpl w:val="1F044704"/>
+    <w:tmpl w:val="870A33D4"/>
     <w:lvl w:ilvl="0">
       <w:start w:val="1"/>
       <w:numFmt w:val="bullet"/>
@@ -1342,9 +1359,9 @@
     </w:lvl>
   </w:abstractNum>
   <w:abstractNum w:abstractNumId="2" w15:restartNumberingAfterBreak="0">
-    <w:nsid w:val="34F85A30"/>
+    <w:nsid w:val="4EC352A4"/>
     <w:multiLevelType w:val="multilevel"/>
-    <w:tmpl w:val="56F69BAE"/>
+    <w:tmpl w:val="2FCADB0A"/>
     <w:lvl w:ilvl="0">
       <w:start w:val="1"/>
       <w:numFmt w:val="bullet"/>
@@ -1491,9 +1508,9 @@
     </w:lvl>
   </w:abstractNum>
   <w:abstractNum w:abstractNumId="3" w15:restartNumberingAfterBreak="0">
-    <w:nsid w:val="633A7AC9"/>
+    <w:nsid w:val="522227EF"/>
     <w:multiLevelType w:val="multilevel"/>
-    <w:tmpl w:val="996EBBC0"/>
+    <w:tmpl w:val="8884ADB4"/>
     <w:lvl w:ilvl="0">
       <w:start w:val="1"/>
       <w:numFmt w:val="bullet"/>
@@ -1639,17 +1656,17 @@
       </w:rPr>
     </w:lvl>
   </w:abstractNum>
-  <w:num w:numId="1" w16cid:durableId="2007244611">
+  <w:num w:numId="1" w16cid:durableId="1774939070">
     <w:abstractNumId w:val="1"/>
   </w:num>
-  <w:num w:numId="2" w16cid:durableId="701902860">
-    <w:abstractNumId w:val="3"/>
+  <w:num w:numId="2" w16cid:durableId="1828596486">
+    <w:abstractNumId w:val="0"/>
   </w:num>
-  <w:num w:numId="3" w16cid:durableId="1795321075">
+  <w:num w:numId="3" w16cid:durableId="1557427576">
     <w:abstractNumId w:val="2"/>
   </w:num>
-  <w:num w:numId="4" w16cid:durableId="2104494448">
-    <w:abstractNumId w:val="0"/>
+  <w:num w:numId="4" w16cid:durableId="722826070">
+    <w:abstractNumId w:val="3"/>
   </w:num>
 </w:numbering>
 </file>
@@ -2053,7 +2070,7 @@
   <w:style w:type="paragraph" w:default="1" w:styleId="Normal">
     <w:name w:val="Normal"/>
     <w:qFormat/>
-    <w:rsid w:val="00BE3275"/>
+    <w:rsid w:val="00814F63"/>
   </w:style>
   <w:style w:type="paragraph" w:styleId="Heading1">
     <w:name w:val="heading 1"/>
@@ -2062,7 +2079,7 @@
     <w:link w:val="Heading1Char"/>
     <w:uiPriority w:val="9"/>
     <w:qFormat/>
-    <w:rsid w:val="00BE3275"/>
+    <w:rsid w:val="00814F63"/>
     <w:pPr>
       <w:keepNext/>
       <w:keepLines/>
@@ -2087,7 +2104,7 @@
     <w:uiPriority w:val="9"/>
     <w:unhideWhenUsed/>
     <w:qFormat/>
-    <w:rsid w:val="00BE3275"/>
+    <w:rsid w:val="00814F63"/>
     <w:pPr>
       <w:keepNext/>
       <w:keepLines/>
@@ -2110,7 +2127,7 @@
     <w:uiPriority w:val="9"/>
     <w:unhideWhenUsed/>
     <w:qFormat/>
-    <w:rsid w:val="00BE3275"/>
+    <w:rsid w:val="00814F63"/>
     <w:pPr>
       <w:keepNext/>
       <w:keepLines/>
@@ -2133,7 +2150,7 @@
     <w:semiHidden/>
     <w:unhideWhenUsed/>
     <w:qFormat/>
-    <w:rsid w:val="00BE3275"/>
+    <w:rsid w:val="00814F63"/>
     <w:pPr>
       <w:keepNext/>
       <w:keepLines/>
@@ -2157,7 +2174,7 @@
     <w:semiHidden/>
     <w:unhideWhenUsed/>
     <w:qFormat/>
-    <w:rsid w:val="00BE3275"/>
+    <w:rsid w:val="00814F63"/>
     <w:pPr>
       <w:keepNext/>
       <w:keepLines/>
@@ -2179,7 +2196,7 @@
     <w:semiHidden/>
     <w:unhideWhenUsed/>
     <w:qFormat/>
-    <w:rsid w:val="00BE3275"/>
+    <w:rsid w:val="00814F63"/>
     <w:pPr>
       <w:keepNext/>
       <w:keepLines/>
@@ -2203,7 +2220,7 @@
     <w:semiHidden/>
     <w:unhideWhenUsed/>
     <w:qFormat/>
-    <w:rsid w:val="00BE3275"/>
+    <w:rsid w:val="00814F63"/>
     <w:pPr>
       <w:keepNext/>
       <w:keepLines/>
@@ -2224,7 +2241,7 @@
     <w:semiHidden/>
     <w:unhideWhenUsed/>
     <w:qFormat/>
-    <w:rsid w:val="00BE3275"/>
+    <w:rsid w:val="00814F63"/>
     <w:pPr>
       <w:keepNext/>
       <w:keepLines/>
@@ -2245,7 +2262,7 @@
     <w:semiHidden/>
     <w:unhideWhenUsed/>
     <w:qFormat/>
-    <w:rsid w:val="00BE3275"/>
+    <w:rsid w:val="00814F63"/>
     <w:pPr>
       <w:keepNext/>
       <w:keepLines/>
@@ -2311,7 +2328,7 @@
     <w:basedOn w:val="DefaultParagraphFont"/>
     <w:link w:val="Heading2"/>
     <w:uiPriority w:val="9"/>
-    <w:rsid w:val="00BE3275"/>
+    <w:rsid w:val="00814F63"/>
     <w:rPr>
       <w:rFonts w:asciiTheme="majorHAnsi" w:eastAsiaTheme="majorEastAsia" w:hAnsiTheme="majorHAnsi" w:cstheme="majorBidi"/>
       <w:b/>
@@ -2325,7 +2342,7 @@
     <w:basedOn w:val="DefaultParagraphFont"/>
     <w:link w:val="Heading3"/>
     <w:uiPriority w:val="9"/>
-    <w:rsid w:val="00BE3275"/>
+    <w:rsid w:val="00814F63"/>
     <w:rPr>
       <w:rFonts w:asciiTheme="majorHAnsi" w:eastAsiaTheme="majorEastAsia" w:hAnsiTheme="majorHAnsi" w:cstheme="majorBidi"/>
       <w:spacing w:val="4"/>
@@ -2401,7 +2418,7 @@
     <w:basedOn w:val="DefaultParagraphFont"/>
     <w:link w:val="Heading1"/>
     <w:uiPriority w:val="9"/>
-    <w:rsid w:val="00BE3275"/>
+    <w:rsid w:val="00814F63"/>
     <w:rPr>
       <w:rFonts w:asciiTheme="majorHAnsi" w:eastAsiaTheme="majorEastAsia" w:hAnsiTheme="majorHAnsi" w:cstheme="majorBidi"/>
       <w:b/>
@@ -2424,7 +2441,7 @@
     <w:basedOn w:val="DefaultParagraphFont"/>
     <w:uiPriority w:val="22"/>
     <w:qFormat/>
-    <w:rsid w:val="00BE3275"/>
+    <w:rsid w:val="00814F63"/>
     <w:rPr>
       <w:b/>
       <w:bCs/>
@@ -2437,7 +2454,7 @@
     <w:link w:val="Heading4"/>
     <w:uiPriority w:val="9"/>
     <w:semiHidden/>
-    <w:rsid w:val="00BE3275"/>
+    <w:rsid w:val="00814F63"/>
     <w:rPr>
       <w:rFonts w:asciiTheme="majorHAnsi" w:eastAsiaTheme="majorEastAsia" w:hAnsiTheme="majorHAnsi" w:cstheme="majorBidi"/>
       <w:i/>
@@ -2452,7 +2469,7 @@
     <w:link w:val="Heading5"/>
     <w:uiPriority w:val="9"/>
     <w:semiHidden/>
-    <w:rsid w:val="00BE3275"/>
+    <w:rsid w:val="00814F63"/>
     <w:rPr>
       <w:rFonts w:asciiTheme="majorHAnsi" w:eastAsiaTheme="majorEastAsia" w:hAnsiTheme="majorHAnsi" w:cstheme="majorBidi"/>
       <w:b/>
@@ -2465,7 +2482,7 @@
     <w:link w:val="Heading6"/>
     <w:uiPriority w:val="9"/>
     <w:semiHidden/>
-    <w:rsid w:val="00BE3275"/>
+    <w:rsid w:val="00814F63"/>
     <w:rPr>
       <w:rFonts w:asciiTheme="majorHAnsi" w:eastAsiaTheme="majorEastAsia" w:hAnsiTheme="majorHAnsi" w:cstheme="majorBidi"/>
       <w:b/>
@@ -2480,7 +2497,7 @@
     <w:link w:val="Heading7"/>
     <w:uiPriority w:val="9"/>
     <w:semiHidden/>
-    <w:rsid w:val="00BE3275"/>
+    <w:rsid w:val="00814F63"/>
     <w:rPr>
       <w:i/>
       <w:iCs/>
@@ -2492,7 +2509,7 @@
     <w:link w:val="Heading8"/>
     <w:uiPriority w:val="9"/>
     <w:semiHidden/>
-    <w:rsid w:val="00BE3275"/>
+    <w:rsid w:val="00814F63"/>
     <w:rPr>
       <w:b/>
       <w:bCs/>
@@ -2504,7 +2521,7 @@
     <w:link w:val="Heading9"/>
     <w:uiPriority w:val="9"/>
     <w:semiHidden/>
-    <w:rsid w:val="00BE3275"/>
+    <w:rsid w:val="00814F63"/>
     <w:rPr>
       <w:i/>
       <w:iCs/>
@@ -2518,7 +2535,7 @@
     <w:semiHidden/>
     <w:unhideWhenUsed/>
     <w:qFormat/>
-    <w:rsid w:val="00BE3275"/>
+    <w:rsid w:val="00814F63"/>
     <w:rPr>
       <w:b/>
       <w:bCs/>
@@ -2533,7 +2550,7 @@
     <w:link w:val="TitleChar"/>
     <w:uiPriority w:val="10"/>
     <w:qFormat/>
-    <w:rsid w:val="00BE3275"/>
+    <w:rsid w:val="00814F63"/>
     <w:pPr>
       <w:spacing w:after="0" w:line="240" w:lineRule="auto"/>
       <w:contextualSpacing/>
@@ -2553,7 +2570,7 @@
     <w:basedOn w:val="DefaultParagraphFont"/>
     <w:link w:val="Title"/>
     <w:uiPriority w:val="10"/>
-    <w:rsid w:val="00BE3275"/>
+    <w:rsid w:val="00814F63"/>
     <w:rPr>
       <w:rFonts w:asciiTheme="majorHAnsi" w:eastAsiaTheme="majorEastAsia" w:hAnsiTheme="majorHAnsi" w:cstheme="majorBidi"/>
       <w:b/>
@@ -2570,7 +2587,7 @@
     <w:link w:val="SubtitleChar"/>
     <w:uiPriority w:val="11"/>
     <w:qFormat/>
-    <w:rsid w:val="00BE3275"/>
+    <w:rsid w:val="00814F63"/>
     <w:pPr>
       <w:numPr>
         <w:ilvl w:val="1"/>
@@ -2589,7 +2606,7 @@
     <w:basedOn w:val="DefaultParagraphFont"/>
     <w:link w:val="Subtitle"/>
     <w:uiPriority w:val="11"/>
-    <w:rsid w:val="00BE3275"/>
+    <w:rsid w:val="00814F63"/>
     <w:rPr>
       <w:rFonts w:asciiTheme="majorHAnsi" w:eastAsiaTheme="majorEastAsia" w:hAnsiTheme="majorHAnsi" w:cstheme="majorBidi"/>
       <w:sz w:val="24"/>
@@ -2601,7 +2618,7 @@
     <w:basedOn w:val="DefaultParagraphFont"/>
     <w:uiPriority w:val="20"/>
     <w:qFormat/>
-    <w:rsid w:val="00BE3275"/>
+    <w:rsid w:val="00814F63"/>
     <w:rPr>
       <w:i/>
       <w:iCs/>
@@ -2612,7 +2629,7 @@
     <w:name w:val="No Spacing"/>
     <w:uiPriority w:val="1"/>
     <w:qFormat/>
-    <w:rsid w:val="00BE3275"/>
+    <w:rsid w:val="00814F63"/>
     <w:pPr>
       <w:spacing w:after="0" w:line="240" w:lineRule="auto"/>
     </w:pPr>
@@ -2624,7 +2641,7 @@
     <w:link w:val="QuoteChar"/>
     <w:uiPriority w:val="29"/>
     <w:qFormat/>
-    <w:rsid w:val="00BE3275"/>
+    <w:rsid w:val="00814F63"/>
     <w:pPr>
       <w:spacing w:before="200" w:line="264" w:lineRule="auto"/>
       <w:ind w:left="864" w:right="864"/>
@@ -2643,7 +2660,7 @@
     <w:basedOn w:val="DefaultParagraphFont"/>
     <w:link w:val="Quote"/>
     <w:uiPriority w:val="29"/>
-    <w:rsid w:val="00BE3275"/>
+    <w:rsid w:val="00814F63"/>
     <w:rPr>
       <w:rFonts w:asciiTheme="majorHAnsi" w:eastAsiaTheme="majorEastAsia" w:hAnsiTheme="majorHAnsi" w:cstheme="majorBidi"/>
       <w:i/>
@@ -2659,7 +2676,7 @@
     <w:link w:val="IntenseQuoteChar"/>
     <w:uiPriority w:val="30"/>
     <w:qFormat/>
-    <w:rsid w:val="00BE3275"/>
+    <w:rsid w:val="00814F63"/>
     <w:pPr>
       <w:spacing w:before="100" w:beforeAutospacing="1" w:after="240"/>
       <w:ind w:left="936" w:right="936"/>
@@ -2676,7 +2693,7 @@
     <w:basedOn w:val="DefaultParagraphFont"/>
     <w:link w:val="IntenseQuote"/>
     <w:uiPriority w:val="30"/>
-    <w:rsid w:val="00BE3275"/>
+    <w:rsid w:val="00814F63"/>
     <w:rPr>
       <w:rFonts w:asciiTheme="majorHAnsi" w:eastAsiaTheme="majorEastAsia" w:hAnsiTheme="majorHAnsi" w:cstheme="majorBidi"/>
       <w:sz w:val="26"/>
@@ -2688,7 +2705,7 @@
     <w:basedOn w:val="DefaultParagraphFont"/>
     <w:uiPriority w:val="19"/>
     <w:qFormat/>
-    <w:rsid w:val="00BE3275"/>
+    <w:rsid w:val="00814F63"/>
     <w:rPr>
       <w:i/>
       <w:iCs/>
@@ -2700,7 +2717,7 @@
     <w:basedOn w:val="DefaultParagraphFont"/>
     <w:uiPriority w:val="21"/>
     <w:qFormat/>
-    <w:rsid w:val="00BE3275"/>
+    <w:rsid w:val="00814F63"/>
     <w:rPr>
       <w:b/>
       <w:bCs/>
@@ -2714,7 +2731,7 @@
     <w:basedOn w:val="DefaultParagraphFont"/>
     <w:uiPriority w:val="31"/>
     <w:qFormat/>
-    <w:rsid w:val="00BE3275"/>
+    <w:rsid w:val="00814F63"/>
     <w:rPr>
       <w:smallCaps/>
       <w:color w:val="auto"/>
@@ -2726,7 +2743,7 @@
     <w:basedOn w:val="DefaultParagraphFont"/>
     <w:uiPriority w:val="32"/>
     <w:qFormat/>
-    <w:rsid w:val="00BE3275"/>
+    <w:rsid w:val="00814F63"/>
     <w:rPr>
       <w:b/>
       <w:bCs/>
@@ -2740,7 +2757,7 @@
     <w:basedOn w:val="DefaultParagraphFont"/>
     <w:uiPriority w:val="33"/>
     <w:qFormat/>
-    <w:rsid w:val="00BE3275"/>
+    <w:rsid w:val="00814F63"/>
     <w:rPr>
       <w:b/>
       <w:bCs/>
@@ -2756,7 +2773,7 @@
     <w:semiHidden/>
     <w:unhideWhenUsed/>
     <w:qFormat/>
-    <w:rsid w:val="00BE3275"/>
+    <w:rsid w:val="00814F63"/>
     <w:pPr>
       <w:outlineLvl w:val="9"/>
     </w:pPr>

</xml_diff>